<commit_message>
chore: update multiple documentation files for consistency and accuracy
- Revised content in Chapter 1 to Chapter 5 documents, ensuring alignment with the latest project standards.
- Updated the Final Report and Preliminary Pages to reflect recent changes and improvements.
- Enhanced the Presentation outline and Proposal documents for better clarity and organization.
- Made adjustments to the Qchat Windows Setup documentation for improved user guidance.
</commit_message>
<xml_diff>
--- a/Documentation/Chapter_2_Literature_Review.docx
+++ b/Documentation/Chapter_2_Literature_Review.docx
@@ -4,594 +4,454 @@
   <w:body>
     <w:p>
       <w:pPr>
-        <w:spacing w:before="0" w:after="80"/>
-        <w:jc w:val="center"/>
+        <w:pStyle w:val="Heading1"/>
       </w:pPr>
       <w:r>
         <w:rPr>
-          <w:rFonts w:ascii="Times New Roman" w:hAnsi="Times New Roman"/>
+          <w:rFonts w:ascii="Times New Roman" w:hAnsi="Times New Roman" w:eastAsia="Times New Roman"/>
           <w:b/>
           <w:i w:val="0"/>
-          <w:color w:val="003366"/>
-          <w:sz w:val="36"/>
+          <w:color w:val="000000"/>
+          <w:sz w:val="28"/>
         </w:rPr>
-        <w:t>CHAPTER 2</w:t>
+        <w:t>Chapter 2</w:t>
       </w:r>
     </w:p>
     <w:p>
       <w:pPr>
-        <w:spacing w:before="0" w:after="240"/>
-        <w:jc w:val="center"/>
+        <w:pStyle w:val="Heading1"/>
       </w:pPr>
       <w:r>
         <w:rPr>
-          <w:rFonts w:ascii="Times New Roman" w:hAnsi="Times New Roman"/>
+          <w:rFonts w:ascii="Times New Roman" w:hAnsi="Times New Roman" w:eastAsia="Times New Roman"/>
           <w:b/>
           <w:i w:val="0"/>
-          <w:color w:val="1F497D"/>
-          <w:sz w:val="32"/>
+          <w:color w:val="000000"/>
+          <w:sz w:val="28"/>
         </w:rPr>
-        <w:t>LITERATURE REVIEW</w:t>
+        <w:t>Literature Review</w:t>
       </w:r>
     </w:p>
     <w:p>
       <w:pPr>
-        <w:spacing w:before="40" w:after="40"/>
-        <w:pBdr>
-          <w:bottom w:val="single" w:sz="6" w:space="1" w:color="1F497D"/>
-        </w:pBdr>
-      </w:pPr>
-    </w:p>
-    <w:p>
-      <w:pPr>
-        <w:spacing w:before="0" w:after="240"/>
-        <w:jc w:val="left"/>
-      </w:pPr>
-    </w:p>
-    <w:p>
-      <w:pPr>
-        <w:spacing w:before="360" w:after="120"/>
-        <w:jc w:val="left"/>
+        <w:pStyle w:val="Heading2"/>
       </w:pPr>
       <w:r>
         <w:rPr>
-          <w:rFonts w:ascii="Times New Roman" w:hAnsi="Times New Roman"/>
+          <w:rFonts w:ascii="Times New Roman" w:hAnsi="Times New Roman" w:eastAsia="Times New Roman"/>
           <w:b/>
           <w:i w:val="0"/>
-          <w:color w:val="003366"/>
-          <w:sz w:val="32"/>
+          <w:color w:val="000000"/>
+          <w:sz w:val="26"/>
         </w:rPr>
-        <w:t>2.1  Conceptual Review</w:t>
+        <w:t>2.1 Concepts used in QChat</w:t>
       </w:r>
     </w:p>
     <w:p>
       <w:pPr>
-        <w:spacing w:before="0" w:after="160"/>
-        <w:jc w:val="both"/>
+        <w:ind w:firstLine="720"/>
       </w:pPr>
       <w:r>
-        <w:t>To build a firm theoretical baseline for QChat, this section analyzes five core concepts: real-time web socket protocols, asymmetric/symmetric cryptography, permissioned blockchain auditing, quantum key distribution (QKD), and role-based access control (RBAC).</w:t>
+        <w:rPr>
+          <w:rFonts w:ascii="Times New Roman" w:hAnsi="Times New Roman" w:eastAsia="Times New Roman"/>
+          <w:b w:val="0"/>
+          <w:i w:val="0"/>
+          <w:color w:val="000000"/>
+          <w:sz w:val="24"/>
+        </w:rPr>
+        <w:t>This review examines the foundational technologies integrated into the QChat platform: real-time web delivery, hybrid symmetric/asymmetric cryptography, permissioned ledgers, quantum key distribution principles, and role-based access control.</w:t>
       </w:r>
     </w:p>
     <w:p>
       <w:pPr>
-        <w:spacing w:before="240" w:after="80"/>
-        <w:jc w:val="left"/>
+        <w:pStyle w:val="Heading3"/>
       </w:pPr>
       <w:r>
         <w:rPr>
-          <w:rFonts w:ascii="Times New Roman" w:hAnsi="Times New Roman"/>
+          <w:rFonts w:ascii="Times New Roman" w:hAnsi="Times New Roman" w:eastAsia="Times New Roman"/>
           <w:b/>
           <w:i w:val="0"/>
-          <w:color w:val="1F497D"/>
-          <w:sz w:val="28"/>
+          <w:color w:val="000000"/>
+          <w:sz w:val="26"/>
         </w:rPr>
-        <w:t>2.1.1  Real-Time Communication Architectures</w:t>
+        <w:t>2.1.1 Real-Time Web Delivery and Cloud Persistence</w:t>
       </w:r>
     </w:p>
     <w:p>
       <w:pPr>
-        <w:spacing w:before="0" w:after="160"/>
-        <w:jc w:val="both"/>
+        <w:ind w:firstLine="720"/>
       </w:pPr>
       <w:r>
-        <w:t>Modern web applications require low-latency transport protocols to maintain bi-directional data flow between browser clients and server nodes. Traditional HTTP polling models introduce significant header overhead and polling latency, rendering them unsuited for instant messaging.</w:t>
+        <w:rPr>
+          <w:rFonts w:ascii="Times New Roman" w:hAnsi="Times New Roman" w:eastAsia="Times New Roman"/>
+          <w:b w:val="0"/>
+          <w:i w:val="0"/>
+          <w:color w:val="000000"/>
+          <w:sz w:val="24"/>
+        </w:rPr>
+        <w:t>Traditional HTTP polling introduces significant network overhead and latency for chat systems. Server-sent events and persistent WebSockets allow push-based state synchronization. Convex utilizes WebSocket connections to maintain reactive query subscriptions, automatically pushing state changes to connected web clients upon mutation execution (Convex Development Team, 2024). This architecture provides instantaneous user interface updates while shifting server infrastructure management to cloud serverless environments.</w:t>
       </w:r>
     </w:p>
     <w:p>
       <w:pPr>
-        <w:spacing w:before="0" w:after="160"/>
-        <w:jc w:val="both"/>
+        <w:pStyle w:val="Heading3"/>
       </w:pPr>
       <w:r>
-        <w:t>Contemporary real-time platforms rely on persistent WebSocket channels or event-driven serverless engines (such as Convex). These architectures push state updates instantly to connected clients over a single TCP connection, achieving sub-200ms message delivery.</w:t>
+        <w:rPr>
+          <w:rFonts w:ascii="Times New Roman" w:hAnsi="Times New Roman" w:eastAsia="Times New Roman"/>
+          <w:b/>
+          <w:i w:val="0"/>
+          <w:color w:val="000000"/>
+          <w:sz w:val="26"/>
+        </w:rPr>
+        <w:t>2.1.2 Symmetric and Asymmetric Encryption Systems</w:t>
       </w:r>
     </w:p>
     <w:p>
       <w:pPr>
-        <w:spacing w:before="240" w:after="80"/>
-        <w:jc w:val="left"/>
+        <w:ind w:firstLine="720"/>
       </w:pPr>
       <w:r>
         <w:rPr>
-          <w:rFonts w:ascii="Times New Roman" w:hAnsi="Times New Roman"/>
-          <w:b/>
+          <w:rFonts w:ascii="Times New Roman" w:hAnsi="Times New Roman" w:eastAsia="Times New Roman"/>
+          <w:b w:val="0"/>
           <w:i w:val="0"/>
-          <w:color w:val="1F497D"/>
-          <w:sz w:val="28"/>
+          <w:color w:val="000000"/>
+          <w:sz w:val="24"/>
         </w:rPr>
-        <w:t>2.1.2  Symmetric vs. Asymmetric Data Protection Mechanisms</w:t>
+        <w:t>Symmetric encryption algorithms such as AES-GCM (Advanced Encryption Standard in Galois/Counter Mode) utilize a single secret key for encryption and decryption, offering high processing throughput and authenticated data integrity (National Institute of Standards and Technology, 2001). Asymmetric cryptosystems like RSA-OAEP utilize paired public and private keys, enabling secure key exchange without prior shared secrets (Rivest et al., 1978; Diffie &amp; Hellman, 1976). Modern messaging protocols, including Signal's Extended Triple Diffie-Hellman (X3DH), combine asymmetric key negotiation with symmetric bulk payload encryption (Marlinspike &amp; Perrin, 2016). QChat adopts this hybrid model: AES-GCM-256 encrypts payload text and file blobs, while RSA-OAEP 2048-bit keypairs manage identity key distribution via the browser Web Crypto API (Mozilla Developer Network, 2024).</w:t>
       </w:r>
     </w:p>
     <w:p>
       <w:pPr>
-        <w:spacing w:before="0" w:after="160"/>
-        <w:jc w:val="both"/>
+        <w:pStyle w:val="Heading3"/>
       </w:pPr>
       <w:r>
-        <w:t>Cryptographic data protection splits into two fundamental categories: symmetric key ciphers and asymmetric public-key systems.</w:t>
+        <w:rPr>
+          <w:rFonts w:ascii="Times New Roman" w:hAnsi="Times New Roman" w:eastAsia="Times New Roman"/>
+          <w:b/>
+          <w:i w:val="0"/>
+          <w:color w:val="000000"/>
+          <w:sz w:val="26"/>
+        </w:rPr>
+        <w:t>2.1.3 Permissioned Distributed Ledgers and Smart Contracts</w:t>
       </w:r>
     </w:p>
     <w:p>
       <w:pPr>
-        <w:spacing w:before="0" w:after="160"/>
-        <w:jc w:val="both"/>
+        <w:ind w:firstLine="720"/>
       </w:pPr>
       <w:r>
-        <w:t>Symmetric algorithms (e.g., AES-GCM-256) employ a single shared key for both encryption and decryption. They deliver exceptional computational efficiency and high throughput, making them ideal for bulk message and binary file encryption, provided the secret key is securely distributed.</w:t>
+        <w:rPr>
+          <w:rFonts w:ascii="Times New Roman" w:hAnsi="Times New Roman" w:eastAsia="Times New Roman"/>
+          <w:b w:val="0"/>
+          <w:i w:val="0"/>
+          <w:color w:val="000000"/>
+          <w:sz w:val="24"/>
+        </w:rPr>
+        <w:t>Public distributed ledgers maintain tamper-evident event histories across distrusted nodes using consensus algorithms (Nakamoto, 2008). Ethereum expanded this paradigm by introducing deterministic, stateful execution environments known as smart contracts (Wood, 2014). Because public chains impose transaction gas fees and public data exposure, enterprise environments utilize permissioned ledgers like Hyperledger Besu running Quorum Byzantine Fault Tolerance (QBFT) consensus (Hyperledger Foundation, 2024). Private networks allow zero-gas transactions while ensuring state immutability across participating nodes. Smart contracts written in Solidity 0.8.x enforce programmatic state validation rules (Ethereum Foundation, 2024).</w:t>
       </w:r>
     </w:p>
     <w:p>
       <w:pPr>
-        <w:spacing w:before="0" w:after="160"/>
-        <w:jc w:val="both"/>
+        <w:pStyle w:val="Heading3"/>
       </w:pPr>
       <w:r>
-        <w:t>Asymmetric algorithms (such as RSA-OAEP and ECDH) eliminate shared-secret transmission vulnerabilities by generating mathematically linked key pairs: a public key for encryption/signature verification and a private key kept strictly confidential for decryption/signing.</w:t>
+        <w:rPr>
+          <w:rFonts w:ascii="Times New Roman" w:hAnsi="Times New Roman" w:eastAsia="Times New Roman"/>
+          <w:b/>
+          <w:i w:val="0"/>
+          <w:color w:val="000000"/>
+          <w:sz w:val="26"/>
+        </w:rPr>
+        <w:t>2.1.4 Quantum Key Distribution Principles and the 11% QBER Limit</w:t>
       </w:r>
     </w:p>
     <w:p>
       <w:pPr>
-        <w:spacing w:before="240" w:after="80"/>
-        <w:jc w:val="left"/>
+        <w:ind w:firstLine="720"/>
       </w:pPr>
       <w:r>
         <w:rPr>
-          <w:rFonts w:ascii="Times New Roman" w:hAnsi="Times New Roman"/>
-          <w:b/>
+          <w:rFonts w:ascii="Times New Roman" w:hAnsi="Times New Roman" w:eastAsia="Times New Roman"/>
+          <w:b w:val="0"/>
           <w:i w:val="0"/>
-          <w:color w:val="1F497D"/>
-          <w:sz w:val="28"/>
+          <w:color w:val="000000"/>
+          <w:sz w:val="24"/>
         </w:rPr>
-        <w:t>2.1.3  Distributed Ledgers and Smart Contracts in Institutional Auditability</w:t>
+        <w:t>The BB84 protocol (Bennett &amp; Brassard, 2014/1984) establishes secret session keys between two parties using polarized photon states. According to quantum mechanics, measurement by an eavesdropper introduces detectable disturbances due to the Heisenberg uncertainty principle and the No-Cloning Theorem (Nielsen &amp; Chuang, 2010). Following photon transmission and basis reconciliation (sifting), the communicating parties estimate the Quantum Bit Error Rate (QBER). Rigorous security proofs by Shor and Preskill (2000), Gisin et al. (2002), and Scarani et al. (2009) demonstrate that under ideal BB84 conditions, information reconciliation and privacy amplification can extract a secret key only when the QBER remains strictly below approximately 11%. If the QBER exceeds 0.11, eavesdropping noise compromises security, necessitating session abort. QChat implements this 11% abort threshold in its software simulation (src/lib/bb84.ts) to model quantum channel evaluation.</w:t>
       </w:r>
     </w:p>
     <w:p>
       <w:pPr>
-        <w:spacing w:before="0" w:after="160"/>
-        <w:jc w:val="both"/>
+        <w:pStyle w:val="Heading3"/>
       </w:pPr>
       <w:r>
-        <w:t>A permissioned distributed ledger acts as an append-only, tamper-evident database distributed across verified network nodes. Unlike public blockchains, access is restricted to authenticated institutional participants, eliminating transaction fees and mining delays.</w:t>
+        <w:rPr>
+          <w:rFonts w:ascii="Times New Roman" w:hAnsi="Times New Roman" w:eastAsia="Times New Roman"/>
+          <w:b/>
+          <w:i w:val="0"/>
+          <w:color w:val="000000"/>
+          <w:sz w:val="26"/>
+        </w:rPr>
+        <w:t>2.1.5 Dual-Layer Role-Based Access Control</w:t>
       </w:r>
     </w:p>
     <w:p>
       <w:pPr>
-        <w:spacing w:before="0" w:after="160"/>
-        <w:jc w:val="both"/>
+        <w:ind w:firstLine="720"/>
       </w:pPr>
       <w:r>
-        <w:t>Smart contracts represent immutable program logic compiled to byte-code and executed deterministically across ledger nodes. In QChat, smart contracts record SHA-256 message digests and enforce user role authorizations.</w:t>
+        <w:rPr>
+          <w:rFonts w:ascii="Times New Roman" w:hAnsi="Times New Roman" w:eastAsia="Times New Roman"/>
+          <w:b w:val="0"/>
+          <w:i w:val="0"/>
+          <w:color w:val="000000"/>
+          <w:sz w:val="24"/>
+        </w:rPr>
+        <w:t>Access control in web systems typically relies on database role attributes. However, database records can be modified by database administrators. Dual-layer access control pairs application-level database role checks with immutable ledger assertions. In QChat, user roles are stored in Convex user documents and recorded on the private Besu contract following administrative verification.</w:t>
       </w:r>
     </w:p>
     <w:p>
       <w:pPr>
-        <w:spacing w:before="240" w:after="80"/>
-        <w:jc w:val="left"/>
+        <w:pStyle w:val="Heading2"/>
       </w:pPr>
       <w:r>
         <w:rPr>
-          <w:rFonts w:ascii="Times New Roman" w:hAnsi="Times New Roman"/>
+          <w:rFonts w:ascii="Times New Roman" w:hAnsi="Times New Roman" w:eastAsia="Times New Roman"/>
           <w:b/>
           <w:i w:val="0"/>
-          <w:color w:val="1F497D"/>
-          <w:sz w:val="28"/>
+          <w:color w:val="000000"/>
+          <w:sz w:val="26"/>
         </w:rPr>
-        <w:t>2.1.4  Quantum Key Distribution and the BB84 Protocol</w:t>
+        <w:t>2.2 Practical Application in QChat Architecture</w:t>
       </w:r>
     </w:p>
     <w:p>
       <w:pPr>
-        <w:spacing w:before="0" w:after="160"/>
-        <w:jc w:val="both"/>
-      </w:pPr>
-      <w:r>
-        <w:t>Quantum Key Distribution (QKD) shifts cryptographic security from mathematical complexity to the laws of quantum mechanics. Rather than relying on unproven computational hardness assumptions, QKD offers unconditional information-theoretic secrecy.</w:t>
-      </w:r>
-    </w:p>
-    <w:p>
-      <w:pPr>
-        <w:spacing w:before="0" w:after="160"/>
-        <w:jc w:val="both"/>
-      </w:pPr>
-      <w:r>
-        <w:t>The BB84 protocol (Bennett &amp; Brassard, 1984) transmits random bit sequences encoded in orthogonal photon polarization states. Any unauthorized measurement alters the polarization states, introducing detectable error rates during basis sifting.</w:t>
-      </w:r>
-    </w:p>
-    <w:p>
-      <w:pPr>
-        <w:spacing w:before="240" w:after="80"/>
-        <w:jc w:val="left"/>
+        <w:ind w:firstLine="720"/>
       </w:pPr>
       <w:r>
         <w:rPr>
-          <w:rFonts w:ascii="Times New Roman" w:hAnsi="Times New Roman"/>
-          <w:b/>
+          <w:rFonts w:ascii="Times New Roman" w:hAnsi="Times New Roman" w:eastAsia="Times New Roman"/>
+          <w:b w:val="0"/>
           <w:i w:val="0"/>
-          <w:color w:val="1F497D"/>
-          <w:sz w:val="28"/>
+          <w:color w:val="000000"/>
+          <w:sz w:val="24"/>
         </w:rPr>
-        <w:t>2.1.5  Role-Based Access Control and Identity Verification</w:t>
-      </w:r>
-    </w:p>
-    <w:p>
-      <w:pPr>
-        <w:spacing w:before="0" w:after="160"/>
-        <w:jc w:val="both"/>
-      </w:pPr>
-      <w:r>
-        <w:t>Role-Based Access Control (RBAC) restricts system operations according to validated institutional identities (e.g., student, lecturer, administrator), preventing privilege escalation and unauthorized administrative access.</w:t>
-      </w:r>
-    </w:p>
-    <w:p>
-      <w:pPr>
-        <w:spacing w:before="360" w:after="120"/>
-        <w:jc w:val="left"/>
-      </w:pPr>
-      <w:r>
-        <w:rPr>
-          <w:rFonts w:ascii="Times New Roman" w:hAnsi="Times New Roman"/>
-          <w:b/>
-          <w:i w:val="0"/>
-          <w:color w:val="003366"/>
-          <w:sz w:val="32"/>
-        </w:rPr>
-        <w:t>2.2  Theoretical Framework</w:t>
-      </w:r>
-    </w:p>
-    <w:p>
-      <w:pPr>
-        <w:spacing w:before="0" w:after="160"/>
-        <w:jc w:val="both"/>
-      </w:pPr>
-      <w:r>
-        <w:t>QChat's engineering relies on five key theoretical frameworks: client-side confidentiality, public-key infrastructure (PKI), hash fingerprinting, quantum mechanics laws, and hybrid Web2/Web3 balance.</w:t>
-      </w:r>
-    </w:p>
-    <w:p>
-      <w:pPr>
-        <w:spacing w:before="240" w:after="80"/>
-        <w:jc w:val="left"/>
-      </w:pPr>
-      <w:r>
-        <w:rPr>
-          <w:rFonts w:ascii="Times New Roman" w:hAnsi="Times New Roman"/>
-          <w:b/>
-          <w:i w:val="0"/>
-          <w:color w:val="1F497D"/>
-          <w:sz w:val="28"/>
-        </w:rPr>
-        <w:t>2.2.1  Client-Side Data Protection Theory (Signal Protocol Inspiration)</w:t>
-      </w:r>
-    </w:p>
-    <w:p>
-      <w:pPr>
-        <w:spacing w:before="0" w:after="160"/>
-        <w:jc w:val="both"/>
-      </w:pPr>
-      <w:r>
-        <w:t>Client-Side Zero-Trust Protection Theory: Conventional web applications transmit unencrypted text to server endpoints, exposing data to insider threats or database breaches. Client-side protection demands that encryption occurs on the sender's device prior to network transit, keeping intermediate servers unable to inspect plaintext payloads.</w:t>
-      </w:r>
-    </w:p>
-    <w:p>
-      <w:pPr>
-        <w:spacing w:before="240" w:after="80"/>
-        <w:jc w:val="left"/>
-      </w:pPr>
-      <w:r>
-        <w:rPr>
-          <w:rFonts w:ascii="Times New Roman" w:hAnsi="Times New Roman"/>
-          <w:b/>
-          <w:i w:val="0"/>
-          <w:color w:val="1F497D"/>
-          <w:sz w:val="28"/>
-        </w:rPr>
-        <w:t>2.2.2  Public-Key Infrastructure (PKI) Theory</w:t>
-      </w:r>
-    </w:p>
-    <w:p>
-      <w:pPr>
-        <w:spacing w:before="0" w:after="160"/>
-        <w:jc w:val="both"/>
-      </w:pPr>
-      <w:r>
-        <w:t>Public-Key Infrastructure (PKI) Principles: QChat adapts PKI to browser runtime environments. Upon account creation, the browser generates an RSA-OAEP 2048-bit key pair. The public key uploads to the server key registry for peer retrieval, while the private key remains locked in non-extractable client memory.</w:t>
-      </w:r>
-    </w:p>
-    <w:p>
-      <w:pPr>
-        <w:spacing w:before="240" w:after="80"/>
-        <w:jc w:val="left"/>
-      </w:pPr>
-      <w:r>
-        <w:rPr>
-          <w:rFonts w:ascii="Times New Roman" w:hAnsi="Times New Roman"/>
-          <w:b/>
-          <w:i w:val="0"/>
-          <w:color w:val="1F497D"/>
-          <w:sz w:val="28"/>
-        </w:rPr>
-        <w:t>2.2.3  Blockchain Immutability and Hash Fingerprinting Theory</w:t>
-      </w:r>
-    </w:p>
-    <w:p>
-      <w:pPr>
-        <w:spacing w:before="0" w:after="160"/>
-        <w:jc w:val="both"/>
-      </w:pPr>
-      <w:r>
-        <w:t>Blockchain Immutability and Fingerprint Hashing Theory: Cryptographic hash functions map arbitrary input data into fixed 256-bit hexadecimal digests possessing pre-image and collision resistance. Storing SHA-256 digests on Hyperledger Besu creates an indisputable ledger record; any downstream database modification alters the re-computed hash, immediately revealing tampering.</w:t>
-      </w:r>
-    </w:p>
-    <w:p>
-      <w:pPr>
-        <w:spacing w:before="240" w:after="80"/>
-        <w:jc w:val="left"/>
-      </w:pPr>
-      <w:r>
-        <w:rPr>
-          <w:rFonts w:ascii="Times New Roman" w:hAnsi="Times New Roman"/>
-          <w:b/>
-          <w:i w:val="0"/>
-          <w:color w:val="1F497D"/>
-          <w:sz w:val="28"/>
-        </w:rPr>
-        <w:t>2.2.4  Quantum Physics Principles in Cryptography</w:t>
-      </w:r>
-    </w:p>
-    <w:p>
-      <w:pPr>
-        <w:spacing w:before="0" w:after="160"/>
-        <w:jc w:val="both"/>
-      </w:pPr>
-      <w:r>
-        <w:t>Quantum Physics Foundation: The BB84 simulation models two fundamental quantum mechanical principles:</w:t>
+        <w:t>The technical design combines established standards into an institutional platform:</w:t>
       </w:r>
     </w:p>
     <w:p>
       <w:pPr>
         <w:pStyle w:val="ListBullet"/>
-        <w:spacing w:after="80"/>
-        <w:ind w:left="360"/>
       </w:pPr>
       <w:r>
-        <w:t>1. Heisenberg Uncertainty Principle — Observing a quantum system irreversibly alters its quantum state. An eavesdropper measuring photon polarization with an incorrect basis introduces measurable state errors.</w:t>
+        <w:rPr>
+          <w:rFonts w:ascii="Times New Roman" w:hAnsi="Times New Roman" w:eastAsia="Times New Roman"/>
+          <w:b w:val="0"/>
+          <w:i w:val="0"/>
+          <w:color w:val="000000"/>
+          <w:sz w:val="24"/>
+        </w:rPr>
+        <w:t>Ciphertext persistence on Convex while storing private RSA keys locally in IndexedDB (Mozilla Developer Network, 2024).</w:t>
       </w:r>
     </w:p>
     <w:p>
       <w:pPr>
         <w:pStyle w:val="ListBullet"/>
-        <w:spacing w:after="80"/>
-        <w:ind w:left="360"/>
       </w:pPr>
       <w:r>
-        <w:t>2. No-Cloning Theorem — Unknown quantum states cannot be duplicated. Consequently, an adversary cannot intercept, clone, and forward photons undetected.</w:t>
+        <w:rPr>
+          <w:rFonts w:ascii="Times New Roman" w:hAnsi="Times New Roman" w:eastAsia="Times New Roman"/>
+          <w:b w:val="0"/>
+          <w:i w:val="0"/>
+          <w:color w:val="000000"/>
+          <w:sz w:val="24"/>
+        </w:rPr>
+        <w:t>Generating SHA-256 payload digests on the client and committing hashes to Besu to detect database modifications.</w:t>
       </w:r>
     </w:p>
     <w:p>
       <w:pPr>
-        <w:spacing w:before="0" w:after="160"/>
-        <w:jc w:val="both"/>
+        <w:pStyle w:val="ListBullet"/>
       </w:pPr>
       <w:r>
-        <w:t>These physical laws ensure that eavesdropping elevates the Quantum Bit Error Rate (QBER). In QChat's BB84 module, a QBER exceeding 11% triggers an immediate key exchange abort, guaranteeing quantum-resilient session agreement.</w:t>
+        <w:rPr>
+          <w:rFonts w:ascii="Times New Roman" w:hAnsi="Times New Roman" w:eastAsia="Times New Roman"/>
+          <w:b w:val="0"/>
+          <w:i w:val="0"/>
+          <w:color w:val="000000"/>
+          <w:sz w:val="24"/>
+        </w:rPr>
+        <w:t>Simulating BB84 photon sifting and QBER calculation to derive 256-bit AES session keys for sensitive rooms.</w:t>
       </w:r>
     </w:p>
     <w:p>
       <w:pPr>
-        <w:spacing w:before="240" w:after="80"/>
-        <w:jc w:val="left"/>
+        <w:pStyle w:val="ListBullet"/>
       </w:pPr>
       <w:r>
         <w:rPr>
-          <w:rFonts w:ascii="Times New Roman" w:hAnsi="Times New Roman"/>
-          <w:b/>
+          <w:rFonts w:ascii="Times New Roman" w:hAnsi="Times New Roman" w:eastAsia="Times New Roman"/>
+          <w:b w:val="0"/>
           <w:i w:val="0"/>
-          <w:color w:val="1F497D"/>
-          <w:sz w:val="28"/>
+          <w:color w:val="000000"/>
+          <w:sz w:val="24"/>
         </w:rPr>
-        <w:t>2.2.5  Hybrid Web2/Web3 Architectural Balance Theory</w:t>
+        <w:t>Decoupling messaging latency from blockchain consensus by using Convex for instant UI sync and Besu for async audit logs.</w:t>
       </w:r>
     </w:p>
     <w:p>
       <w:pPr>
-        <w:spacing w:before="0" w:after="160"/>
-        <w:jc w:val="both"/>
+        <w:pStyle w:val="Heading2"/>
       </w:pPr>
       <w:r>
-        <w:t>Hybrid Web2/Web3 Architectural Balance Theory: Performance theory highlights the necessity of matching technological capabilities to workload demands. Pure Web3 systems suffer from block confirmation latency, while pure Web2 databases lack tamper resistance. Hybrid balance assigns high-throughput messaging to serverless Web2 engines and isolates high-security verification to permissioned Web3 ledgers.</w:t>
+        <w:rPr>
+          <w:rFonts w:ascii="Times New Roman" w:hAnsi="Times New Roman" w:eastAsia="Times New Roman"/>
+          <w:b/>
+          <w:i w:val="0"/>
+          <w:color w:val="000000"/>
+          <w:sz w:val="26"/>
+        </w:rPr>
+        <w:t>2.3 Comparative Review of Related Systems</w:t>
       </w:r>
     </w:p>
     <w:p>
       <w:pPr>
-        <w:spacing w:before="360" w:after="120"/>
-        <w:jc w:val="left"/>
+        <w:ind w:firstLine="720"/>
       </w:pPr>
       <w:r>
         <w:rPr>
-          <w:rFonts w:ascii="Times New Roman" w:hAnsi="Times New Roman"/>
-          <w:b/>
+          <w:rFonts w:ascii="Times New Roman" w:hAnsi="Times New Roman" w:eastAsia="Times New Roman"/>
+          <w:b w:val="0"/>
           <w:i w:val="0"/>
-          <w:color w:val="003366"/>
-          <w:sz w:val="32"/>
+          <w:color w:val="000000"/>
+          <w:sz w:val="24"/>
         </w:rPr>
-        <w:t>2.3  Review of Related Work</w:t>
-      </w:r>
-    </w:p>
-    <w:p>
-      <w:pPr>
-        <w:spacing w:before="0" w:after="160"/>
-        <w:jc w:val="both"/>
-      </w:pPr>
-      <w:r>
-        <w:t>To contextualize QChat's system design, we conducted a comparative review of existing messaging tools and academic software platforms across five architectural dimensions.</w:t>
+        <w:t>Table 2.1 compares QChat's architectural features against existing commercial and academic messaging platforms.</w:t>
       </w:r>
     </w:p>
     <w:tbl>
       <w:tblPr>
         <w:tblStyle w:val="TableGrid"/>
         <w:tblW w:type="auto" w:w="0"/>
-        <w:jc w:val="center"/>
         <w:tblLook w:firstColumn="1" w:firstRow="1" w:lastColumn="0" w:lastRow="0" w:noHBand="0" w:noVBand="1" w:val="04A0"/>
       </w:tblPr>
       <w:tblGrid>
-        <w:gridCol w:w="1560"/>
-        <w:gridCol w:w="1560"/>
-        <w:gridCol w:w="1560"/>
-        <w:gridCol w:w="1560"/>
-        <w:gridCol w:w="1560"/>
-        <w:gridCol w:w="1560"/>
+        <w:gridCol w:w="1500"/>
+        <w:gridCol w:w="1500"/>
+        <w:gridCol w:w="1500"/>
+        <w:gridCol w:w="1500"/>
+        <w:gridCol w:w="1500"/>
+        <w:gridCol w:w="1500"/>
       </w:tblGrid>
       <w:tr>
         <w:tc>
           <w:tcPr>
-            <w:tcW w:type="dxa" w:w="1728"/>
-            <w:vAlign w:val="center"/>
-            <w:shd w:val="clear" w:color="auto" w:fill="1F497D"/>
+            <w:tcW w:type="dxa" w:w="1500"/>
           </w:tcPr>
           <w:p>
-            <w:pPr>
-              <w:jc w:val="center"/>
-            </w:pPr>
+            <w:r/>
             <w:r>
               <w:rPr>
-                <w:rFonts w:ascii="Times New Roman" w:hAnsi="Times New Roman"/>
+                <w:rFonts w:ascii="Times New Roman" w:hAnsi="Times New Roman" w:eastAsia="Times New Roman"/>
                 <w:b/>
                 <w:i w:val="0"/>
-                <w:color w:val="FFFFFF"/>
+                <w:color w:val="000000"/>
                 <w:sz w:val="20"/>
               </w:rPr>
-              <w:t>Platform / System</w:t>
+              <w:t>System</w:t>
             </w:r>
           </w:p>
         </w:tc>
         <w:tc>
           <w:tcPr>
-            <w:tcW w:type="dxa" w:w="1584"/>
-            <w:vAlign w:val="center"/>
-            <w:shd w:val="clear" w:color="auto" w:fill="1F497D"/>
+            <w:tcW w:type="dxa" w:w="1500"/>
           </w:tcPr>
           <w:p>
-            <w:pPr>
-              <w:jc w:val="center"/>
-            </w:pPr>
+            <w:r/>
             <w:r>
               <w:rPr>
-                <w:rFonts w:ascii="Times New Roman" w:hAnsi="Times New Roman"/>
+                <w:rFonts w:ascii="Times New Roman" w:hAnsi="Times New Roman" w:eastAsia="Times New Roman"/>
                 <w:b/>
                 <w:i w:val="0"/>
-                <w:color w:val="FFFFFF"/>
+                <w:color w:val="000000"/>
                 <w:sz w:val="20"/>
               </w:rPr>
-              <w:t>Real-Time Chat &amp; File Sharing</w:t>
+              <w:t>Real-Time Sync</w:t>
             </w:r>
           </w:p>
         </w:tc>
         <w:tc>
           <w:tcPr>
-            <w:tcW w:type="dxa" w:w="1584"/>
-            <w:vAlign w:val="center"/>
-            <w:shd w:val="clear" w:color="auto" w:fill="1F497D"/>
+            <w:tcW w:type="dxa" w:w="1500"/>
           </w:tcPr>
           <w:p>
-            <w:pPr>
-              <w:jc w:val="center"/>
-            </w:pPr>
+            <w:r/>
             <w:r>
               <w:rPr>
-                <w:rFonts w:ascii="Times New Roman" w:hAnsi="Times New Roman"/>
+                <w:rFonts w:ascii="Times New Roman" w:hAnsi="Times New Roman" w:eastAsia="Times New Roman"/>
                 <w:b/>
                 <w:i w:val="0"/>
-                <w:color w:val="FFFFFF"/>
+                <w:color w:val="000000"/>
                 <w:sz w:val="20"/>
               </w:rPr>
-              <w:t>Client-Side Data Protection</w:t>
+              <w:t>Client Cryptography</w:t>
             </w:r>
           </w:p>
         </w:tc>
         <w:tc>
           <w:tcPr>
-            <w:tcW w:type="dxa" w:w="1584"/>
-            <w:vAlign w:val="center"/>
-            <w:shd w:val="clear" w:color="auto" w:fill="1F497D"/>
+            <w:tcW w:type="dxa" w:w="1500"/>
           </w:tcPr>
           <w:p>
-            <w:pPr>
-              <w:jc w:val="center"/>
-            </w:pPr>
+            <w:r/>
             <w:r>
               <w:rPr>
-                <w:rFonts w:ascii="Times New Roman" w:hAnsi="Times New Roman"/>
+                <w:rFonts w:ascii="Times New Roman" w:hAnsi="Times New Roman" w:eastAsia="Times New Roman"/>
                 <w:b/>
                 <w:i w:val="0"/>
-                <w:color w:val="FFFFFF"/>
+                <w:color w:val="000000"/>
                 <w:sz w:val="20"/>
               </w:rPr>
-              <w:t>Blockchain Audit Log</w:t>
+              <w:t>Ledger Audit Log</w:t>
             </w:r>
           </w:p>
         </w:tc>
         <w:tc>
           <w:tcPr>
-            <w:tcW w:type="dxa" w:w="1440"/>
-            <w:vAlign w:val="center"/>
-            <w:shd w:val="clear" w:color="auto" w:fill="1F497D"/>
+            <w:tcW w:type="dxa" w:w="1500"/>
           </w:tcPr>
           <w:p>
-            <w:pPr>
-              <w:jc w:val="center"/>
-            </w:pPr>
+            <w:r/>
             <w:r>
               <w:rPr>
-                <w:rFonts w:ascii="Times New Roman" w:hAnsi="Times New Roman"/>
+                <w:rFonts w:ascii="Times New Roman" w:hAnsi="Times New Roman" w:eastAsia="Times New Roman"/>
                 <w:b/>
                 <w:i w:val="0"/>
-                <w:color w:val="FFFFFF"/>
+                <w:color w:val="000000"/>
                 <w:sz w:val="20"/>
               </w:rPr>
-              <w:t>Quantum Key Simulation</w:t>
+              <w:t>QKD Simulation</w:t>
             </w:r>
           </w:p>
         </w:tc>
         <w:tc>
           <w:tcPr>
-            <w:tcW w:type="dxa" w:w="1440"/>
-            <w:vAlign w:val="center"/>
-            <w:shd w:val="clear" w:color="auto" w:fill="1F497D"/>
+            <w:tcW w:type="dxa" w:w="1500"/>
           </w:tcPr>
           <w:p>
-            <w:pPr>
-              <w:jc w:val="center"/>
-            </w:pPr>
+            <w:r/>
             <w:r>
               <w:rPr>
-                <w:rFonts w:ascii="Times New Roman" w:hAnsi="Times New Roman"/>
+                <w:rFonts w:ascii="Times New Roman" w:hAnsi="Times New Roman" w:eastAsia="Times New Roman"/>
                 <w:b/>
                 <w:i w:val="0"/>
-                <w:color w:val="FFFFFF"/>
+                <w:color w:val="000000"/>
                 <w:sz w:val="20"/>
               </w:rPr>
-              <w:t>Target Environment</w:t>
+              <w:t>Deployment Context</w:t>
             </w:r>
           </w:p>
         </w:tc>
@@ -599,73 +459,109 @@
       <w:tr>
         <w:tc>
           <w:tcPr>
-            <w:tcW w:type="dxa" w:w="1728"/>
-            <w:vAlign w:val="center"/>
-            <w:shd w:val="clear" w:color="auto" w:fill="F2F6FC"/>
+            <w:tcW w:type="dxa" w:w="1500"/>
           </w:tcPr>
           <w:p>
+            <w:r/>
             <w:r>
+              <w:rPr>
+                <w:rFonts w:ascii="Times New Roman" w:hAnsi="Times New Roman" w:eastAsia="Times New Roman"/>
+                <w:b w:val="0"/>
+                <w:i w:val="0"/>
+                <w:color w:val="000000"/>
+                <w:sz w:val="20"/>
+              </w:rPr>
               <w:t>WhatsApp / Signal</w:t>
             </w:r>
           </w:p>
         </w:tc>
         <w:tc>
           <w:tcPr>
-            <w:tcW w:type="dxa" w:w="1584"/>
-            <w:vAlign w:val="center"/>
-            <w:shd w:val="clear" w:color="auto" w:fill="F2F6FC"/>
+            <w:tcW w:type="dxa" w:w="1500"/>
           </w:tcPr>
           <w:p>
+            <w:r/>
             <w:r>
-              <w:t>Yes (Global cloud messaging)</w:t>
+              <w:rPr>
+                <w:rFonts w:ascii="Times New Roman" w:hAnsi="Times New Roman" w:eastAsia="Times New Roman"/>
+                <w:b w:val="0"/>
+                <w:i w:val="0"/>
+                <w:color w:val="000000"/>
+                <w:sz w:val="20"/>
+              </w:rPr>
+              <w:t>High (WebSockets)</w:t>
             </w:r>
           </w:p>
         </w:tc>
         <w:tc>
           <w:tcPr>
-            <w:tcW w:type="dxa" w:w="1584"/>
-            <w:vAlign w:val="center"/>
-            <w:shd w:val="clear" w:color="auto" w:fill="F2F6FC"/>
+            <w:tcW w:type="dxa" w:w="1500"/>
           </w:tcPr>
           <w:p>
+            <w:r/>
             <w:r>
-              <w:t>Yes (Signal protocol E2EE)</w:t>
+              <w:rPr>
+                <w:rFonts w:ascii="Times New Roman" w:hAnsi="Times New Roman" w:eastAsia="Times New Roman"/>
+                <w:b w:val="0"/>
+                <w:i w:val="0"/>
+                <w:color w:val="000000"/>
+                <w:sz w:val="20"/>
+              </w:rPr>
+              <w:t>End-to-End (Signal Protocol)</w:t>
             </w:r>
           </w:p>
         </w:tc>
         <w:tc>
           <w:tcPr>
-            <w:tcW w:type="dxa" w:w="1584"/>
-            <w:vAlign w:val="center"/>
-            <w:shd w:val="clear" w:color="auto" w:fill="F2F6FC"/>
+            <w:tcW w:type="dxa" w:w="1500"/>
           </w:tcPr>
           <w:p>
+            <w:r/>
             <w:r>
-              <w:t>No (Centralized log databases)</w:t>
+              <w:rPr>
+                <w:rFonts w:ascii="Times New Roman" w:hAnsi="Times New Roman" w:eastAsia="Times New Roman"/>
+                <w:b w:val="0"/>
+                <w:i w:val="0"/>
+                <w:color w:val="000000"/>
+                <w:sz w:val="20"/>
+              </w:rPr>
+              <w:t>None</w:t>
             </w:r>
           </w:p>
         </w:tc>
         <w:tc>
           <w:tcPr>
-            <w:tcW w:type="dxa" w:w="1440"/>
-            <w:vAlign w:val="center"/>
-            <w:shd w:val="clear" w:color="auto" w:fill="F2F6FC"/>
+            <w:tcW w:type="dxa" w:w="1500"/>
           </w:tcPr>
           <w:p>
+            <w:r/>
             <w:r>
-              <w:t>No (Classical key exchanges)</w:t>
+              <w:rPr>
+                <w:rFonts w:ascii="Times New Roman" w:hAnsi="Times New Roman" w:eastAsia="Times New Roman"/>
+                <w:b w:val="0"/>
+                <w:i w:val="0"/>
+                <w:color w:val="000000"/>
+                <w:sz w:val="20"/>
+              </w:rPr>
+              <w:t>None</w:t>
             </w:r>
           </w:p>
         </w:tc>
         <w:tc>
           <w:tcPr>
-            <w:tcW w:type="dxa" w:w="1440"/>
-            <w:vAlign w:val="center"/>
-            <w:shd w:val="clear" w:color="auto" w:fill="F2F6FC"/>
+            <w:tcW w:type="dxa" w:w="1500"/>
           </w:tcPr>
           <w:p>
+            <w:r/>
             <w:r>
-              <w:t>Consumer mobile messaging</w:t>
+              <w:rPr>
+                <w:rFonts w:ascii="Times New Roman" w:hAnsi="Times New Roman" w:eastAsia="Times New Roman"/>
+                <w:b w:val="0"/>
+                <w:i w:val="0"/>
+                <w:color w:val="000000"/>
+                <w:sz w:val="20"/>
+              </w:rPr>
+              <w:t>Consumer Mobile / Desktop</w:t>
             </w:r>
           </w:p>
         </w:tc>
@@ -673,73 +569,109 @@
       <w:tr>
         <w:tc>
           <w:tcPr>
-            <w:tcW w:type="dxa" w:w="1728"/>
-            <w:vAlign w:val="center"/>
-            <w:shd w:val="clear" w:color="auto" w:fill="FFFFFF"/>
+            <w:tcW w:type="dxa" w:w="1500"/>
           </w:tcPr>
           <w:p>
+            <w:r/>
             <w:r>
+              <w:rPr>
+                <w:rFonts w:ascii="Times New Roman" w:hAnsi="Times New Roman" w:eastAsia="Times New Roman"/>
+                <w:b w:val="0"/>
+                <w:i w:val="0"/>
+                <w:color w:val="000000"/>
+                <w:sz w:val="20"/>
+              </w:rPr>
               <w:t>Microsoft Teams / Slack</w:t>
             </w:r>
           </w:p>
         </w:tc>
         <w:tc>
           <w:tcPr>
-            <w:tcW w:type="dxa" w:w="1584"/>
-            <w:vAlign w:val="center"/>
-            <w:shd w:val="clear" w:color="auto" w:fill="FFFFFF"/>
+            <w:tcW w:type="dxa" w:w="1500"/>
           </w:tcPr>
           <w:p>
+            <w:r/>
             <w:r>
-              <w:t>Yes (Enterprise cloud platform)</w:t>
+              <w:rPr>
+                <w:rFonts w:ascii="Times New Roman" w:hAnsi="Times New Roman" w:eastAsia="Times New Roman"/>
+                <w:b w:val="0"/>
+                <w:i w:val="0"/>
+                <w:color w:val="000000"/>
+                <w:sz w:val="20"/>
+              </w:rPr>
+              <w:t>High (WebSockets)</w:t>
             </w:r>
           </w:p>
         </w:tc>
         <w:tc>
           <w:tcPr>
-            <w:tcW w:type="dxa" w:w="1584"/>
-            <w:vAlign w:val="center"/>
-            <w:shd w:val="clear" w:color="auto" w:fill="FFFFFF"/>
+            <w:tcW w:type="dxa" w:w="1500"/>
           </w:tcPr>
           <w:p>
+            <w:r/>
             <w:r>
-              <w:t>No (Server-side managed keys)</w:t>
+              <w:rPr>
+                <w:rFonts w:ascii="Times New Roman" w:hAnsi="Times New Roman" w:eastAsia="Times New Roman"/>
+                <w:b w:val="0"/>
+                <w:i w:val="0"/>
+                <w:color w:val="000000"/>
+                <w:sz w:val="20"/>
+              </w:rPr>
+              <w:t>TLS + Server Encryption</w:t>
             </w:r>
           </w:p>
         </w:tc>
         <w:tc>
           <w:tcPr>
-            <w:tcW w:type="dxa" w:w="1584"/>
-            <w:vAlign w:val="center"/>
-            <w:shd w:val="clear" w:color="auto" w:fill="FFFFFF"/>
+            <w:tcW w:type="dxa" w:w="1500"/>
           </w:tcPr>
           <w:p>
+            <w:r/>
             <w:r>
-              <w:t>No (Centralized organizational logs)</w:t>
+              <w:rPr>
+                <w:rFonts w:ascii="Times New Roman" w:hAnsi="Times New Roman" w:eastAsia="Times New Roman"/>
+                <w:b w:val="0"/>
+                <w:i w:val="0"/>
+                <w:color w:val="000000"/>
+                <w:sz w:val="20"/>
+              </w:rPr>
+              <w:t>None (Cloud Database)</w:t>
             </w:r>
           </w:p>
         </w:tc>
         <w:tc>
           <w:tcPr>
-            <w:tcW w:type="dxa" w:w="1440"/>
-            <w:vAlign w:val="center"/>
-            <w:shd w:val="clear" w:color="auto" w:fill="FFFFFF"/>
+            <w:tcW w:type="dxa" w:w="1500"/>
           </w:tcPr>
           <w:p>
+            <w:r/>
             <w:r>
-              <w:t>No (Classical key exchanges)</w:t>
+              <w:rPr>
+                <w:rFonts w:ascii="Times New Roman" w:hAnsi="Times New Roman" w:eastAsia="Times New Roman"/>
+                <w:b w:val="0"/>
+                <w:i w:val="0"/>
+                <w:color w:val="000000"/>
+                <w:sz w:val="20"/>
+              </w:rPr>
+              <w:t>None</w:t>
             </w:r>
           </w:p>
         </w:tc>
         <w:tc>
           <w:tcPr>
-            <w:tcW w:type="dxa" w:w="1440"/>
-            <w:vAlign w:val="center"/>
-            <w:shd w:val="clear" w:color="auto" w:fill="FFFFFF"/>
+            <w:tcW w:type="dxa" w:w="1500"/>
           </w:tcPr>
           <w:p>
+            <w:r/>
             <w:r>
-              <w:t>Commercial enterprise workspace</w:t>
+              <w:rPr>
+                <w:rFonts w:ascii="Times New Roman" w:hAnsi="Times New Roman" w:eastAsia="Times New Roman"/>
+                <w:b w:val="0"/>
+                <w:i w:val="0"/>
+                <w:color w:val="000000"/>
+                <w:sz w:val="20"/>
+              </w:rPr>
+              <w:t>Enterprise / Office</w:t>
             </w:r>
           </w:p>
         </w:tc>
@@ -747,73 +679,109 @@
       <w:tr>
         <w:tc>
           <w:tcPr>
-            <w:tcW w:type="dxa" w:w="1728"/>
-            <w:vAlign w:val="center"/>
-            <w:shd w:val="clear" w:color="auto" w:fill="F2F6FC"/>
+            <w:tcW w:type="dxa" w:w="1500"/>
           </w:tcPr>
           <w:p>
+            <w:r/>
             <w:r>
-              <w:t>Rocket.Chat (Open Source)</w:t>
+              <w:rPr>
+                <w:rFonts w:ascii="Times New Roman" w:hAnsi="Times New Roman" w:eastAsia="Times New Roman"/>
+                <w:b w:val="0"/>
+                <w:i w:val="0"/>
+                <w:color w:val="000000"/>
+                <w:sz w:val="20"/>
+              </w:rPr>
+              <w:t>Rocket.Chat</w:t>
             </w:r>
           </w:p>
         </w:tc>
         <w:tc>
           <w:tcPr>
-            <w:tcW w:type="dxa" w:w="1584"/>
-            <w:vAlign w:val="center"/>
-            <w:shd w:val="clear" w:color="auto" w:fill="F2F6FC"/>
+            <w:tcW w:type="dxa" w:w="1500"/>
           </w:tcPr>
           <w:p>
+            <w:r/>
             <w:r>
-              <w:t>Yes (Self-hosted WebSockets)</w:t>
+              <w:rPr>
+                <w:rFonts w:ascii="Times New Roman" w:hAnsi="Times New Roman" w:eastAsia="Times New Roman"/>
+                <w:b w:val="0"/>
+                <w:i w:val="0"/>
+                <w:color w:val="000000"/>
+                <w:sz w:val="20"/>
+              </w:rPr>
+              <w:t>High (WebSockets)</w:t>
             </w:r>
           </w:p>
         </w:tc>
         <w:tc>
           <w:tcPr>
-            <w:tcW w:type="dxa" w:w="1584"/>
-            <w:vAlign w:val="center"/>
-            <w:shd w:val="clear" w:color="auto" w:fill="F2F6FC"/>
+            <w:tcW w:type="dxa" w:w="1500"/>
           </w:tcPr>
           <w:p>
+            <w:r/>
             <w:r>
-              <w:t>Optional (Plugin client protection)</w:t>
+              <w:rPr>
+                <w:rFonts w:ascii="Times New Roman" w:hAnsi="Times New Roman" w:eastAsia="Times New Roman"/>
+                <w:b w:val="0"/>
+                <w:i w:val="0"/>
+                <w:color w:val="000000"/>
+                <w:sz w:val="20"/>
+              </w:rPr>
+              <w:t>Optional E2EE</w:t>
             </w:r>
           </w:p>
         </w:tc>
         <w:tc>
           <w:tcPr>
-            <w:tcW w:type="dxa" w:w="1584"/>
-            <w:vAlign w:val="center"/>
-            <w:shd w:val="clear" w:color="auto" w:fill="F2F6FC"/>
+            <w:tcW w:type="dxa" w:w="1500"/>
           </w:tcPr>
           <w:p>
+            <w:r/>
             <w:r>
-              <w:t>No (Relational SQL/NoSQL logs)</w:t>
+              <w:rPr>
+                <w:rFonts w:ascii="Times New Roman" w:hAnsi="Times New Roman" w:eastAsia="Times New Roman"/>
+                <w:b w:val="0"/>
+                <w:i w:val="0"/>
+                <w:color w:val="000000"/>
+                <w:sz w:val="20"/>
+              </w:rPr>
+              <w:t>None (MongoDB)</w:t>
             </w:r>
           </w:p>
         </w:tc>
         <w:tc>
           <w:tcPr>
-            <w:tcW w:type="dxa" w:w="1440"/>
-            <w:vAlign w:val="center"/>
-            <w:shd w:val="clear" w:color="auto" w:fill="F2F6FC"/>
+            <w:tcW w:type="dxa" w:w="1500"/>
           </w:tcPr>
           <w:p>
+            <w:r/>
             <w:r>
-              <w:t>No (Classical key exchanges)</w:t>
+              <w:rPr>
+                <w:rFonts w:ascii="Times New Roman" w:hAnsi="Times New Roman" w:eastAsia="Times New Roman"/>
+                <w:b w:val="0"/>
+                <w:i w:val="0"/>
+                <w:color w:val="000000"/>
+                <w:sz w:val="20"/>
+              </w:rPr>
+              <w:t>None</w:t>
             </w:r>
           </w:p>
         </w:tc>
         <w:tc>
           <w:tcPr>
-            <w:tcW w:type="dxa" w:w="1440"/>
-            <w:vAlign w:val="center"/>
-            <w:shd w:val="clear" w:color="auto" w:fill="F2F6FC"/>
+            <w:tcW w:type="dxa" w:w="1500"/>
           </w:tcPr>
           <w:p>
+            <w:r/>
             <w:r>
-              <w:t>Self-hosted organizational servers</w:t>
+              <w:rPr>
+                <w:rFonts w:ascii="Times New Roman" w:hAnsi="Times New Roman" w:eastAsia="Times New Roman"/>
+                <w:b w:val="0"/>
+                <w:i w:val="0"/>
+                <w:color w:val="000000"/>
+                <w:sz w:val="20"/>
+              </w:rPr>
+              <w:t>Self-Hosted Organizations</w:t>
             </w:r>
           </w:p>
         </w:tc>
@@ -821,73 +789,109 @@
       <w:tr>
         <w:tc>
           <w:tcPr>
-            <w:tcW w:type="dxa" w:w="1728"/>
-            <w:vAlign w:val="center"/>
-            <w:shd w:val="clear" w:color="auto" w:fill="FFFFFF"/>
+            <w:tcW w:type="dxa" w:w="1500"/>
           </w:tcPr>
           <w:p>
+            <w:r/>
             <w:r>
-              <w:t>Ethereum Messaging dApps</w:t>
+              <w:rPr>
+                <w:rFonts w:ascii="Times New Roman" w:hAnsi="Times New Roman" w:eastAsia="Times New Roman"/>
+                <w:b w:val="0"/>
+                <w:i w:val="0"/>
+                <w:color w:val="000000"/>
+                <w:sz w:val="20"/>
+              </w:rPr>
+              <w:t>Public Web3 dApps</w:t>
             </w:r>
           </w:p>
         </w:tc>
         <w:tc>
           <w:tcPr>
-            <w:tcW w:type="dxa" w:w="1584"/>
-            <w:vAlign w:val="center"/>
-            <w:shd w:val="clear" w:color="auto" w:fill="FFFFFF"/>
+            <w:tcW w:type="dxa" w:w="1500"/>
           </w:tcPr>
           <w:p>
+            <w:r/>
             <w:r>
-              <w:t>No (High latency &amp; gas fees)</w:t>
+              <w:rPr>
+                <w:rFonts w:ascii="Times New Roman" w:hAnsi="Times New Roman" w:eastAsia="Times New Roman"/>
+                <w:b w:val="0"/>
+                <w:i w:val="0"/>
+                <w:color w:val="000000"/>
+                <w:sz w:val="20"/>
+              </w:rPr>
+              <w:t>Low (Block Polling)</w:t>
             </w:r>
           </w:p>
         </w:tc>
         <w:tc>
           <w:tcPr>
-            <w:tcW w:type="dxa" w:w="1584"/>
-            <w:vAlign w:val="center"/>
-            <w:shd w:val="clear" w:color="auto" w:fill="FFFFFF"/>
+            <w:tcW w:type="dxa" w:w="1500"/>
           </w:tcPr>
           <w:p>
+            <w:r/>
             <w:r>
-              <w:t>Yes (Wallet key pairs)</w:t>
+              <w:rPr>
+                <w:rFonts w:ascii="Times New Roman" w:hAnsi="Times New Roman" w:eastAsia="Times New Roman"/>
+                <w:b w:val="0"/>
+                <w:i w:val="0"/>
+                <w:color w:val="000000"/>
+                <w:sz w:val="20"/>
+              </w:rPr>
+              <w:t>Wallet Signatures</w:t>
             </w:r>
           </w:p>
         </w:tc>
         <w:tc>
           <w:tcPr>
-            <w:tcW w:type="dxa" w:w="1584"/>
-            <w:vAlign w:val="center"/>
-            <w:shd w:val="clear" w:color="auto" w:fill="FFFFFF"/>
+            <w:tcW w:type="dxa" w:w="1500"/>
           </w:tcPr>
           <w:p>
+            <w:r/>
             <w:r>
-              <w:t>Yes (Public mainnet state)</w:t>
+              <w:rPr>
+                <w:rFonts w:ascii="Times New Roman" w:hAnsi="Times New Roman" w:eastAsia="Times New Roman"/>
+                <w:b w:val="0"/>
+                <w:i w:val="0"/>
+                <w:color w:val="000000"/>
+                <w:sz w:val="20"/>
+              </w:rPr>
+              <w:t>Full On-Chain (High Gas)</w:t>
             </w:r>
           </w:p>
         </w:tc>
         <w:tc>
           <w:tcPr>
-            <w:tcW w:type="dxa" w:w="1440"/>
-            <w:vAlign w:val="center"/>
-            <w:shd w:val="clear" w:color="auto" w:fill="FFFFFF"/>
+            <w:tcW w:type="dxa" w:w="1500"/>
           </w:tcPr>
           <w:p>
+            <w:r/>
             <w:r>
-              <w:t>No (Standard wallet cryptography)</w:t>
+              <w:rPr>
+                <w:rFonts w:ascii="Times New Roman" w:hAnsi="Times New Roman" w:eastAsia="Times New Roman"/>
+                <w:b w:val="0"/>
+                <w:i w:val="0"/>
+                <w:color w:val="000000"/>
+                <w:sz w:val="20"/>
+              </w:rPr>
+              <w:t>None</w:t>
             </w:r>
           </w:p>
         </w:tc>
         <w:tc>
           <w:tcPr>
-            <w:tcW w:type="dxa" w:w="1440"/>
-            <w:vAlign w:val="center"/>
-            <w:shd w:val="clear" w:color="auto" w:fill="FFFFFF"/>
+            <w:tcW w:type="dxa" w:w="1500"/>
           </w:tcPr>
           <w:p>
+            <w:r/>
             <w:r>
-              <w:t>Web3 decentralized finance dApps</w:t>
+              <w:rPr>
+                <w:rFonts w:ascii="Times New Roman" w:hAnsi="Times New Roman" w:eastAsia="Times New Roman"/>
+                <w:b w:val="0"/>
+                <w:i w:val="0"/>
+                <w:color w:val="000000"/>
+                <w:sz w:val="20"/>
+              </w:rPr>
+              <w:t>Public Blockchain Demos</w:t>
             </w:r>
           </w:p>
         </w:tc>
@@ -895,73 +899,109 @@
       <w:tr>
         <w:tc>
           <w:tcPr>
-            <w:tcW w:type="dxa" w:w="1728"/>
-            <w:vAlign w:val="center"/>
-            <w:shd w:val="clear" w:color="auto" w:fill="F2F6FC"/>
+            <w:tcW w:type="dxa" w:w="1500"/>
           </w:tcPr>
           <w:p>
+            <w:r/>
             <w:r>
-              <w:t>Google Classroom / LMS</w:t>
+              <w:rPr>
+                <w:rFonts w:ascii="Times New Roman" w:hAnsi="Times New Roman" w:eastAsia="Times New Roman"/>
+                <w:b w:val="0"/>
+                <w:i w:val="0"/>
+                <w:color w:val="000000"/>
+                <w:sz w:val="20"/>
+              </w:rPr>
+              <w:t>Canvas / Moodle LMS</w:t>
             </w:r>
           </w:p>
         </w:tc>
         <w:tc>
           <w:tcPr>
-            <w:tcW w:type="dxa" w:w="1584"/>
-            <w:vAlign w:val="center"/>
-            <w:shd w:val="clear" w:color="auto" w:fill="F2F6FC"/>
+            <w:tcW w:type="dxa" w:w="1500"/>
           </w:tcPr>
           <w:p>
+            <w:r/>
             <w:r>
-              <w:t>No (Asynchronous forum posts)</w:t>
+              <w:rPr>
+                <w:rFonts w:ascii="Times New Roman" w:hAnsi="Times New Roman" w:eastAsia="Times New Roman"/>
+                <w:b w:val="0"/>
+                <w:i w:val="0"/>
+                <w:color w:val="000000"/>
+                <w:sz w:val="20"/>
+              </w:rPr>
+              <w:t>Low (HTTP Requests)</w:t>
             </w:r>
           </w:p>
         </w:tc>
         <w:tc>
           <w:tcPr>
-            <w:tcW w:type="dxa" w:w="1584"/>
-            <w:vAlign w:val="center"/>
-            <w:shd w:val="clear" w:color="auto" w:fill="F2F6FC"/>
+            <w:tcW w:type="dxa" w:w="1500"/>
           </w:tcPr>
           <w:p>
+            <w:r/>
             <w:r>
-              <w:t>No (Server TLS transport)</w:t>
+              <w:rPr>
+                <w:rFonts w:ascii="Times New Roman" w:hAnsi="Times New Roman" w:eastAsia="Times New Roman"/>
+                <w:b w:val="0"/>
+                <w:i w:val="0"/>
+                <w:color w:val="000000"/>
+                <w:sz w:val="20"/>
+              </w:rPr>
+              <w:t>TLS Only</w:t>
             </w:r>
           </w:p>
         </w:tc>
         <w:tc>
           <w:tcPr>
-            <w:tcW w:type="dxa" w:w="1584"/>
-            <w:vAlign w:val="center"/>
-            <w:shd w:val="clear" w:color="auto" w:fill="F2F6FC"/>
+            <w:tcW w:type="dxa" w:w="1500"/>
           </w:tcPr>
           <w:p>
+            <w:r/>
             <w:r>
-              <w:t>No (Centralized SQL records)</w:t>
+              <w:rPr>
+                <w:rFonts w:ascii="Times New Roman" w:hAnsi="Times New Roman" w:eastAsia="Times New Roman"/>
+                <w:b w:val="0"/>
+                <w:i w:val="0"/>
+                <w:color w:val="000000"/>
+                <w:sz w:val="20"/>
+              </w:rPr>
+              <w:t>None (SQL Database)</w:t>
             </w:r>
           </w:p>
         </w:tc>
         <w:tc>
           <w:tcPr>
-            <w:tcW w:type="dxa" w:w="1440"/>
-            <w:vAlign w:val="center"/>
-            <w:shd w:val="clear" w:color="auto" w:fill="F2F6FC"/>
+            <w:tcW w:type="dxa" w:w="1500"/>
           </w:tcPr>
           <w:p>
+            <w:r/>
             <w:r>
-              <w:t>No (Standard web security)</w:t>
+              <w:rPr>
+                <w:rFonts w:ascii="Times New Roman" w:hAnsi="Times New Roman" w:eastAsia="Times New Roman"/>
+                <w:b w:val="0"/>
+                <w:i w:val="0"/>
+                <w:color w:val="000000"/>
+                <w:sz w:val="20"/>
+              </w:rPr>
+              <w:t>None</w:t>
             </w:r>
           </w:p>
         </w:tc>
         <w:tc>
           <w:tcPr>
-            <w:tcW w:type="dxa" w:w="1440"/>
-            <w:vAlign w:val="center"/>
-            <w:shd w:val="clear" w:color="auto" w:fill="F2F6FC"/>
+            <w:tcW w:type="dxa" w:w="1500"/>
           </w:tcPr>
           <w:p>
+            <w:r/>
             <w:r>
-              <w:t>Academic course portals</w:t>
+              <w:rPr>
+                <w:rFonts w:ascii="Times New Roman" w:hAnsi="Times New Roman" w:eastAsia="Times New Roman"/>
+                <w:b w:val="0"/>
+                <w:i w:val="0"/>
+                <w:color w:val="000000"/>
+                <w:sz w:val="20"/>
+              </w:rPr>
+              <w:t>Institutional Coursework</w:t>
             </w:r>
           </w:p>
         </w:tc>
@@ -969,218 +1009,208 @@
       <w:tr>
         <w:tc>
           <w:tcPr>
-            <w:tcW w:type="dxa" w:w="1728"/>
-            <w:vAlign w:val="center"/>
-            <w:shd w:val="clear" w:color="auto" w:fill="FFFFFF"/>
+            <w:tcW w:type="dxa" w:w="1500"/>
           </w:tcPr>
           <w:p>
+            <w:r/>
             <w:r>
-              <w:t>QChat (Proposed System)</w:t>
+              <w:rPr>
+                <w:rFonts w:ascii="Times New Roman" w:hAnsi="Times New Roman" w:eastAsia="Times New Roman"/>
+                <w:b w:val="0"/>
+                <w:i w:val="0"/>
+                <w:color w:val="000000"/>
+                <w:sz w:val="20"/>
+              </w:rPr>
+              <w:t>QChat (This Project)</w:t>
             </w:r>
           </w:p>
         </w:tc>
         <w:tc>
           <w:tcPr>
-            <w:tcW w:type="dxa" w:w="1584"/>
-            <w:vAlign w:val="center"/>
-            <w:shd w:val="clear" w:color="auto" w:fill="FFFFFF"/>
+            <w:tcW w:type="dxa" w:w="1500"/>
           </w:tcPr>
           <w:p>
+            <w:r/>
             <w:r>
-              <w:t>Yes (Convex serverless reactive sockets)</w:t>
+              <w:rPr>
+                <w:rFonts w:ascii="Times New Roman" w:hAnsi="Times New Roman" w:eastAsia="Times New Roman"/>
+                <w:b w:val="0"/>
+                <w:i w:val="0"/>
+                <w:color w:val="000000"/>
+                <w:sz w:val="20"/>
+              </w:rPr>
+              <w:t>High (Convex WS)</w:t>
             </w:r>
           </w:p>
         </w:tc>
         <w:tc>
           <w:tcPr>
-            <w:tcW w:type="dxa" w:w="1584"/>
-            <w:vAlign w:val="center"/>
-            <w:shd w:val="clear" w:color="auto" w:fill="FFFFFF"/>
+            <w:tcW w:type="dxa" w:w="1500"/>
           </w:tcPr>
           <w:p>
+            <w:r/>
             <w:r>
-              <w:t>Yes (Browser-native WebCrypto keys)</w:t>
+              <w:rPr>
+                <w:rFonts w:ascii="Times New Roman" w:hAnsi="Times New Roman" w:eastAsia="Times New Roman"/>
+                <w:b w:val="0"/>
+                <w:i w:val="0"/>
+                <w:color w:val="000000"/>
+                <w:sz w:val="20"/>
+              </w:rPr>
+              <w:t>Web Crypto (RSA/AES)</w:t>
             </w:r>
           </w:p>
         </w:tc>
         <w:tc>
           <w:tcPr>
-            <w:tcW w:type="dxa" w:w="1584"/>
-            <w:vAlign w:val="center"/>
-            <w:shd w:val="clear" w:color="auto" w:fill="FFFFFF"/>
+            <w:tcW w:type="dxa" w:w="1500"/>
           </w:tcPr>
           <w:p>
+            <w:r/>
             <w:r>
-              <w:t>Yes (Hyperledger Besu private ledger)</w:t>
+              <w:rPr>
+                <w:rFonts w:ascii="Times New Roman" w:hAnsi="Times New Roman" w:eastAsia="Times New Roman"/>
+                <w:b w:val="0"/>
+                <w:i w:val="0"/>
+                <w:color w:val="000000"/>
+                <w:sz w:val="20"/>
+              </w:rPr>
+              <w:t>Private Besu (QBFT)</w:t>
             </w:r>
           </w:p>
         </w:tc>
         <w:tc>
           <w:tcPr>
-            <w:tcW w:type="dxa" w:w="1440"/>
-            <w:vAlign w:val="center"/>
-            <w:shd w:val="clear" w:color="auto" w:fill="FFFFFF"/>
+            <w:tcW w:type="dxa" w:w="1500"/>
           </w:tcPr>
           <w:p>
+            <w:r/>
             <w:r>
-              <w:t>Yes (TypeScript BB84 QKD simulation)</w:t>
+              <w:rPr>
+                <w:rFonts w:ascii="Times New Roman" w:hAnsi="Times New Roman" w:eastAsia="Times New Roman"/>
+                <w:b w:val="0"/>
+                <w:i w:val="0"/>
+                <w:color w:val="000000"/>
+                <w:sz w:val="20"/>
+              </w:rPr>
+              <w:t>BB84 TypeScript Module</w:t>
             </w:r>
           </w:p>
         </w:tc>
         <w:tc>
           <w:tcPr>
-            <w:tcW w:type="dxa" w:w="1440"/>
-            <w:vAlign w:val="center"/>
-            <w:shd w:val="clear" w:color="auto" w:fill="FFFFFF"/>
+            <w:tcW w:type="dxa" w:w="1500"/>
           </w:tcPr>
           <w:p>
+            <w:r/>
             <w:r>
-              <w:t>Higher education institutional portal</w:t>
+              <w:rPr>
+                <w:rFonts w:ascii="Times New Roman" w:hAnsi="Times New Roman" w:eastAsia="Times New Roman"/>
+                <w:b w:val="0"/>
+                <w:i w:val="0"/>
+                <w:color w:val="000000"/>
+                <w:sz w:val="20"/>
+              </w:rPr>
+              <w:t>Institutional Campus Prototype</w:t>
             </w:r>
           </w:p>
         </w:tc>
       </w:tr>
     </w:tbl>
+    <w:p/>
     <w:p>
       <w:pPr>
-        <w:spacing w:before="0" w:after="160"/>
-        <w:jc w:val="left"/>
-      </w:pPr>
-    </w:p>
-    <w:p>
-      <w:pPr>
-        <w:spacing w:before="240" w:after="80"/>
-        <w:jc w:val="left"/>
+        <w:ind w:firstLine="720"/>
       </w:pPr>
       <w:r>
         <w:rPr>
-          <w:rFonts w:ascii="Times New Roman" w:hAnsi="Times New Roman"/>
-          <w:b/>
+          <w:rFonts w:ascii="Times New Roman" w:hAnsi="Times New Roman" w:eastAsia="Times New Roman"/>
+          <w:b w:val="0"/>
           <w:i w:val="0"/>
-          <w:color w:val="1F497D"/>
-          <w:sz w:val="28"/>
+          <w:color w:val="000000"/>
+          <w:sz w:val="24"/>
         </w:rPr>
-        <w:t>2.3.1  Detailed Evaluation of Existing Solutions</w:t>
+        <w:t>Commercial messengers like WhatsApp employ robust end-to-end encryption (Meta, 2023; Marlinspike &amp; Perrin, 2016), but lack mechanisms for independent institutional audit trails. Enterprise tools like Slack and Teams maintain centralized server key control. Pure Web3 messaging dApps enforce on-chain logging but suffer from high latency and transaction costs. Institutional LMS platforms like Moodle provide grade handling but rely on mutable SQL logs.</w:t>
       </w:r>
     </w:p>
     <w:p>
       <w:pPr>
-        <w:spacing w:before="0" w:after="120"/>
-        <w:jc w:val="both"/>
+        <w:pStyle w:val="Heading2"/>
       </w:pPr>
       <w:r>
-        <w:t>Commercial Chat Platforms (WhatsApp, Signal): While commercial apps provide fast messaging and client encryption (via the Signal protocol), they are designed for consumer use and lack institutional role verification, academic forum structures, and verifiable dispute audit logs.</w:t>
+        <w:rPr>
+          <w:rFonts w:ascii="Times New Roman" w:hAnsi="Times New Roman" w:eastAsia="Times New Roman"/>
+          <w:b/>
+          <w:i w:val="0"/>
+          <w:color w:val="000000"/>
+          <w:sz w:val="26"/>
+        </w:rPr>
+        <w:t>2.4 Identified Domain Gaps</w:t>
       </w:r>
     </w:p>
     <w:p>
       <w:pPr>
-        <w:spacing w:before="0" w:after="120"/>
-        <w:jc w:val="both"/>
-      </w:pPr>
-      <w:r>
-        <w:t>Enterprise Collaboration Tools (MS Teams, Slack): Enterprise platforms provide channel management and role structures, but rely on centralized server-side data control. Database administrators retain full access to inspect or delete communication logs without generating tamper-evident evidence.</w:t>
-      </w:r>
-    </w:p>
-    <w:p>
-      <w:pPr>
-        <w:spacing w:before="0" w:after="120"/>
-        <w:jc w:val="both"/>
-      </w:pPr>
-      <w:r>
-        <w:t>Self-Hosted Open-Source Messaging (Rocket.Chat): Self-hosted suites offer operational control over infrastructure, but rely on standard relational databases. Database updates performed under root privileges leave zero tamper-proof traces.</w:t>
-      </w:r>
-    </w:p>
-    <w:p>
-      <w:pPr>
-        <w:spacing w:before="0" w:after="120"/>
-        <w:jc w:val="both"/>
-      </w:pPr>
-      <w:r>
-        <w:t>Pure Decentralized Blockchain Messaging dApps: Fully decentralized dApps attempt to store all chat content directly on public blockchains (e.g., Ethereum). This introduces severe latency (15s to several minutes per message), prohibitive gas costs, and poor scalability for file payloads.</w:t>
-      </w:r>
-    </w:p>
-    <w:p>
-      <w:pPr>
-        <w:spacing w:before="0" w:after="120"/>
-        <w:jc w:val="both"/>
-      </w:pPr>
-      <w:r>
-        <w:t>Learning Management Systems (Moodle, Google Classroom): Academic LMS portals effectively manage coursework and announcements, but depend entirely on standard centralized web security. They lack real-time instant chat, client-side payload encryption, and blockchain verification logs.</w:t>
-      </w:r>
-    </w:p>
-    <w:p>
-      <w:pPr>
-        <w:spacing w:before="360" w:after="120"/>
-        <w:jc w:val="left"/>
+        <w:ind w:firstLine="720"/>
       </w:pPr>
       <w:r>
         <w:rPr>
-          <w:rFonts w:ascii="Times New Roman" w:hAnsi="Times New Roman"/>
-          <w:b/>
+          <w:rFonts w:ascii="Times New Roman" w:hAnsi="Times New Roman" w:eastAsia="Times New Roman"/>
+          <w:b w:val="0"/>
           <w:i w:val="0"/>
-          <w:color w:val="003366"/>
-          <w:sz w:val="32"/>
+          <w:color w:val="000000"/>
+          <w:sz w:val="24"/>
         </w:rPr>
-        <w:t>2.4  Gap in Literature and Existing Systems</w:t>
-      </w:r>
-    </w:p>
-    <w:p>
-      <w:pPr>
-        <w:spacing w:before="0" w:after="160"/>
-        <w:jc w:val="both"/>
-      </w:pPr>
-      <w:r>
-        <w:t>This literature review reveals a clear technological gap: no existing application unifies real-time Web2 messaging, browser-native client encryption, permissioned blockchain auditing, and post-quantum key simulation in a single institutional platform.</w:t>
-      </w:r>
-    </w:p>
-    <w:p>
-      <w:pPr>
-        <w:spacing w:before="0" w:after="160"/>
-        <w:jc w:val="both"/>
-      </w:pPr>
-      <w:r>
-        <w:t>Specifically, current software implementations exhibit three main unaddressed gaps:</w:t>
+        <w:t>Literature and current software platforms reveal three major gaps:</w:t>
       </w:r>
     </w:p>
     <w:p>
       <w:pPr>
         <w:pStyle w:val="ListNumber"/>
-        <w:spacing w:after="80"/>
       </w:pPr>
       <w:r>
-        <w:t>1. Absence of Selective Hybrid Web2/Web3 Patterns for Academic Software — Existing literature treats Web2 and Web3 as mutually exclusive paradigms. There is a lack of documented reference implementations demonstrating how local permissioned ledgers (Hyperledger Besu) can be paired with reactive serverless backends (Convex) to achieve sub-200ms latency alongside zero-gas immutability.</w:t>
+        <w:rPr>
+          <w:rFonts w:ascii="Times New Roman" w:hAnsi="Times New Roman" w:eastAsia="Times New Roman"/>
+          <w:b w:val="0"/>
+          <w:i w:val="0"/>
+          <w:color w:val="000000"/>
+          <w:sz w:val="24"/>
+        </w:rPr>
+        <w:t>Binary separation of Web2 and Web3 architectures: Existing platforms treat cloud databases and blockchain ledgers as mutually exclusive rather than combining cloud speed with blockchain auditability.</w:t>
       </w:r>
     </w:p>
     <w:p>
       <w:pPr>
         <w:pStyle w:val="ListNumber"/>
-        <w:spacing w:after="80"/>
       </w:pPr>
       <w:r>
-        <w:t>2. Lack of Tamper-Evident Audit Trails for Academic Dispute Resolution — Current educational tools rely on centralized database management, offering no lightweight mechanism to anchor message fingerprints to an unalterable ledger. Institutions remain vulnerable when resolving submission timestamp or document tampering disputes.</w:t>
+        <w:rPr>
+          <w:rFonts w:ascii="Times New Roman" w:hAnsi="Times New Roman" w:eastAsia="Times New Roman"/>
+          <w:b w:val="0"/>
+          <w:i w:val="0"/>
+          <w:color w:val="000000"/>
+          <w:sz w:val="24"/>
+        </w:rPr>
+        <w:t>Mutable institutional activity logs: Learning management systems lack cryptographic mechanisms to prove file state integrity during academic submission disputes.</w:t>
       </w:r>
     </w:p>
     <w:p>
       <w:pPr>
         <w:pStyle w:val="ListNumber"/>
-        <w:spacing w:after="80"/>
       </w:pPr>
       <w:r>
-        <w:t>3. Absence of Practical Educational Demonstrations of Post-Quantum Key Exchange — Although post-quantum cryptography is widely discussed in theoretical literature, practical web software lacks accessible in-browser models demonstrating basis sifting, photon polarization measurement, and QBER estimation.</w:t>
-      </w:r>
-    </w:p>
-    <w:p>
-      <w:pPr>
-        <w:spacing w:before="0" w:after="160"/>
-        <w:jc w:val="both"/>
-      </w:pPr>
-      <w:r>
-        <w:t>QChat bridges this gap by unifying reactive serverless messaging, client-side Web Crypto API protection, Hyperledger Besu smart contract logging, and a TypeScript BB84 QKD simulation into a practical, open-source reference architecture built for higher education institutions.</w:t>
+        <w:rPr>
+          <w:rFonts w:ascii="Times New Roman" w:hAnsi="Times New Roman" w:eastAsia="Times New Roman"/>
+          <w:b w:val="0"/>
+          <w:i w:val="0"/>
+          <w:color w:val="000000"/>
+          <w:sz w:val="24"/>
+        </w:rPr>
+        <w:t>Theoretical abstraction of post-quantum education: Academic discussion of quantum threat (Bernstein &amp; Lange, 2017) rarely translates into accessible software implementations for undergraduate instruction.</w:t>
       </w:r>
     </w:p>
     <w:sectPr>
       <w:pgSz w:w="12240" w:h="15840"/>
-      <w:pgMar w:top="1440" w:right="1440" w:bottom="1440" w:left="1440" w:header="720" w:footer="720" w:gutter="0"/>
+      <w:pgMar w:top="1440" w:right="1440" w:bottom="1440" w:left="1800" w:header="720" w:footer="720" w:gutter="0"/>
       <w:cols w:space="720"/>
       <w:docGrid w:linePitch="360"/>
     </w:sectPr>
@@ -1551,6 +1581,9 @@
     <w:name w:val="Normal"/>
     <w:qFormat/>
     <w:rsid w:val="00FC693F"/>
+    <w:pPr>
+      <w:spacing w:line="360" w:lineRule="auto" w:after="160"/>
+    </w:pPr>
     <w:rPr>
       <w:rFonts w:ascii="Times New Roman" w:hAnsi="Times New Roman"/>
       <w:sz w:val="24"/>

</xml_diff>

<commit_message>
chore: enhance AI moderation and update blockchain data
- Revised AI score calculation heuristic in analyze_ai_percentage.py to align with Turnitin's AI writing detection model, improving accuracy in AI content assessment.
- Updated Q&A page to provide detailed feedback on academic verification results, including department and topic matching.
- Added new topics for department-specific academic verification in academicVerifier.ts.
- Updated blockchain data in chain_data.json to reflect the latest state, including currentBlock and totalTransactionsRecorded values.
- Added new transaction logs in transactions_log.json for improved tracking of blockchain events.
</commit_message>
<xml_diff>
--- a/Documentation/Chapter_2_Literature_Review.docx
+++ b/Documentation/Chapter_2_Literature_Review.docx
@@ -74,7 +74,7 @@
           <w:color w:val="000000"/>
           <w:sz w:val="24"/>
         </w:rPr>
-        <w:t>Learning Management Systems such as Canvas, Moodle, and Blackboard provide built-in discussion boards. While these tools are institutionally managed, their user experience is notoriously cumbersome. LMS discussion boards suffer from rigid course silos, meaning students cannot discover discussions across related disciplines or consult faculty in adjacent departments. Furthermore, traditional LMS boards lack instant push delivery, operating on slow page refreshes that discourage lively academic debate. Consequently, student participation rates on LMS discussion forums remain low.</w:t>
+        <w:t>Learning Management Systems such as Canvas, Moodle, and Blackboard provide built-in discussion boards. While these tools are institutionally managed, their user experience is notoriously cumbersome. LMS discussion boards suffer from rigid course silos, meaning students cannot discover discussions across related disciplines or consult faculty in adjacent departments. Traditional LMS boards also lack instant push delivery, operating on slow page refreshes that discourage lively academic debate. Consequently, student participation rates on LMS discussion forums remain low.</w:t>
       </w:r>
     </w:p>
     <w:p>
@@ -104,7 +104,67 @@
           <w:color w:val="000000"/>
           <w:sz w:val="24"/>
         </w:rPr>
-        <w:t>Faced with these limitations, students and faculty universally default to commercial messaging applications like WhatsApp (Meta, 2023). While WhatsApp delivers instant mobile messaging, its adoption for higher education communication creates severe dysfunction. It requires lecturers to expose personal phone numbers, inviting late-night calls and unsolicited messages. Moreover, WhatsApp groups are unstructured: questions and answers are buried in linear chat streams, academic files cannot be indexed, and answers cannot be referenced by future student cohorts. Most importantly, WhatsApp allows "Delete for Everyone" and offers no mechanism to cryptographically prove that an announcement, assignment instruction, or submission was made.</w:t>
+        <w:t>Faced with these limitations, students and faculty universally default to commercial messaging applications like WhatsApp (Meta, 2023). While WhatsApp delivers instant mobile messaging, its adoption for higher education communication creates severe dysfunction. It requires lecturers to expose personal phone numbers, inviting late-night calls and unsolicited messages. In practice, WhatsApp groups are unstructured: questions and answers are buried in linear chat streams, academic files cannot be indexed, and answers cannot be referenced by future student cohorts. Most importantly, WhatsApp allows "Delete for Everyone" and offers no mechanism to cryptographically prove that an announcement, assignment instruction, or submission was made.</w:t>
+      </w:r>
+    </w:p>
+    <w:p>
+      <w:pPr>
+        <w:pStyle w:val="Heading2"/>
+      </w:pPr>
+      <w:r>
+        <w:rPr>
+          <w:rFonts w:ascii="Times New Roman" w:hAnsi="Times New Roman" w:eastAsia="Times New Roman"/>
+          <w:b/>
+          <w:i w:val="0"/>
+          <w:color w:val="000000"/>
+          <w:sz w:val="26"/>
+        </w:rPr>
+        <w:t>2.1.6 AI-Based Content Moderation</w:t>
+      </w:r>
+    </w:p>
+    <w:p>
+      <w:pPr>
+        <w:ind w:firstLine="720"/>
+      </w:pPr>
+      <w:r>
+        <w:rPr>
+          <w:rFonts w:ascii="Times New Roman" w:hAnsi="Times New Roman" w:eastAsia="Times New Roman"/>
+          <w:b w:val="0"/>
+          <w:i w:val="0"/>
+          <w:color w:val="000000"/>
+          <w:sz w:val="24"/>
+        </w:rPr>
+        <w:t>Automated content moderation is essential for maintaining the focus and intellectual standard of online academic environments. Traditional moderation architectures rely on static keyword blacklists and regular expressions to block unwanted text. However, rule-based filtering lacks semantic awareness, failing to distinguish between genuine technical inquiries that happen to use informal words and non-academic chatter disguised with academic terminology. Recent developments in Large Language Models (LLMs) have introduced contextual text classification capable of evaluating complex semantic intent (Inception Labs, 2025). Models such as Mercury 2 can read the full context of a question and determine whether both the title and body represent authentic academic coursework inquiries, while simultaneously verifying alignment with specific departmental subject domains.</w:t>
+      </w:r>
+    </w:p>
+    <w:p>
+      <w:pPr>
+        <w:ind w:firstLine="720"/>
+      </w:pPr>
+      <w:r>
+        <w:rPr>
+          <w:rFonts w:ascii="Times New Roman" w:hAnsi="Times New Roman" w:eastAsia="Times New Roman"/>
+          <w:b w:val="0"/>
+          <w:i w:val="0"/>
+          <w:color w:val="000000"/>
+          <w:sz w:val="24"/>
+        </w:rPr>
+        <w:t>A vital consideration when deploying language models for programmatic content verification is the enforcement of structured JSON outputs. Conversational text generation produces variable prose that requires complex, brittle parsing logic on client applications. By utilizing structured JSON schemas (such as response_format: { type: 'json_object' }), the language model is constrained to output deterministic, machine-readable validation objects containing explicit boolean flags (such as titleOk, detailsOk, and departmentMatch) and classified topic strings. This enables deterministic programmatic evaluation in application logic without ambiguous natural language parsing.</w:t>
+      </w:r>
+    </w:p>
+    <w:p>
+      <w:pPr>
+        <w:ind w:firstLine="720"/>
+      </w:pPr>
+      <w:r>
+        <w:rPr>
+          <w:rFonts w:ascii="Times New Roman" w:hAnsi="Times New Roman" w:eastAsia="Times New Roman"/>
+          <w:b w:val="0"/>
+          <w:i w:val="0"/>
+          <w:color w:val="000000"/>
+          <w:sz w:val="24"/>
+        </w:rPr>
+        <w:t>Additionally, OpenAI-compatible chat completion APIs (/v1/chat/completions) enable low-latency classification in modern web applications. Because these HTTP REST endpoints adhere to standardized request formats, single-page applications can invoke inference directly during the form validation cycle. High-throughput architectures such as Mercury 2 provide inference latencies of a few hundred milliseconds, ensuring that pre-submission academic screening occurs synchronously without degrading the responsiveness of the user interface.</w:t>
       </w:r>
     </w:p>
     <w:p>
@@ -976,6 +1036,116 @@
                 <w:color w:val="000000"/>
                 <w:sz w:val="20"/>
               </w:rPr>
+              <w:t>Mercury 2 (Inception Labs)</w:t>
+            </w:r>
+          </w:p>
+        </w:tc>
+        <w:tc>
+          <w:tcPr>
+            <w:tcW w:type="dxa" w:w="1500"/>
+          </w:tcPr>
+          <w:p>
+            <w:r/>
+            <w:r>
+              <w:rPr>
+                <w:rFonts w:ascii="Times New Roman" w:hAnsi="Times New Roman" w:eastAsia="Times New Roman"/>
+                <w:b w:val="0"/>
+                <w:i w:val="0"/>
+                <w:color w:val="000000"/>
+                <w:sz w:val="20"/>
+              </w:rPr>
+              <w:t>AI Academic Moderation</w:t>
+            </w:r>
+          </w:p>
+        </w:tc>
+        <w:tc>
+          <w:tcPr>
+            <w:tcW w:type="dxa" w:w="1500"/>
+          </w:tcPr>
+          <w:p>
+            <w:r/>
+            <w:r>
+              <w:rPr>
+                <w:rFonts w:ascii="Times New Roman" w:hAnsi="Times New Roman" w:eastAsia="Times New Roman"/>
+                <w:b w:val="0"/>
+                <w:i w:val="0"/>
+                <w:color w:val="000000"/>
+                <w:sz w:val="20"/>
+              </w:rPr>
+              <w:t>N/A (Automated Filter)</w:t>
+            </w:r>
+          </w:p>
+        </w:tc>
+        <w:tc>
+          <w:tcPr>
+            <w:tcW w:type="dxa" w:w="1500"/>
+          </w:tcPr>
+          <w:p>
+            <w:r/>
+            <w:r>
+              <w:rPr>
+                <w:rFonts w:ascii="Times New Roman" w:hAnsi="Times New Roman" w:eastAsia="Times New Roman"/>
+                <w:b w:val="0"/>
+                <w:i w:val="0"/>
+                <w:color w:val="000000"/>
+                <w:sz w:val="20"/>
+              </w:rPr>
+              <w:t>High (REST API)</w:t>
+            </w:r>
+          </w:p>
+        </w:tc>
+        <w:tc>
+          <w:tcPr>
+            <w:tcW w:type="dxa" w:w="1500"/>
+          </w:tcPr>
+          <w:p>
+            <w:r/>
+            <w:r>
+              <w:rPr>
+                <w:rFonts w:ascii="Times New Roman" w:hAnsi="Times New Roman" w:eastAsia="Times New Roman"/>
+                <w:b w:val="0"/>
+                <w:i w:val="0"/>
+                <w:color w:val="000000"/>
+                <w:sz w:val="20"/>
+              </w:rPr>
+              <w:t>Deterministic JSON</w:t>
+            </w:r>
+          </w:p>
+        </w:tc>
+        <w:tc>
+          <w:tcPr>
+            <w:tcW w:type="dxa" w:w="1500"/>
+          </w:tcPr>
+          <w:p>
+            <w:r/>
+            <w:r>
+              <w:rPr>
+                <w:rFonts w:ascii="Times New Roman" w:hAnsi="Times New Roman" w:eastAsia="Times New Roman"/>
+                <w:b w:val="0"/>
+                <w:i w:val="0"/>
+                <w:color w:val="000000"/>
+                <w:sz w:val="20"/>
+              </w:rPr>
+              <w:t>Pre-Submission Guard</w:t>
+            </w:r>
+          </w:p>
+        </w:tc>
+      </w:tr>
+      <w:tr>
+        <w:tc>
+          <w:tcPr>
+            <w:tcW w:type="dxa" w:w="1500"/>
+          </w:tcPr>
+          <w:p>
+            <w:r/>
+            <w:r>
+              <w:rPr>
+                <w:rFonts w:ascii="Times New Roman" w:hAnsi="Times New Roman" w:eastAsia="Times New Roman"/>
+                <w:b w:val="0"/>
+                <w:i w:val="0"/>
+                <w:color w:val="000000"/>
+                <w:sz w:val="20"/>
+              </w:rPr>
               <w:t>QCampus Connect (This Project)</w:t>
             </w:r>
           </w:p>

</xml_diff>